<commit_message>
Polish send-money article: loved one, fix bio rendering
- Replace 'your person' with 'your loved one'
- Join bio block to single line so italic/roman book titles render correctly in .docx

Co-Authored-By: Claude Sonnet 4.6 <noreply@anthropic.com>
Claude-Session: https://claude.ai/code/session_015RE4AKHUoaX39pobuT8oag
</commit_message>
<xml_diff>
--- a/content/substack/federal-prison-send-money-day-one.docx
+++ b/content/substack/federal-prison-send-money-day-one.docx
@@ -159,7 +159,7 @@
           <w:i w:val="0"/>
           <w:sz w:val="22"/>
         </w:rPr>
-        <w:t>The second thing to know is that the BOP is one connected system. If your person gets transferred three months later, the money goes with them. Same account. Nothing is lost and nothing needs to be resent. You put money into the BOP system and it stays with them wherever they go.</w:t>
+        <w:t>The second thing to know is that the BOP is one connected system. If your loved one gets transferred three months later, the money goes with them. Same account. Nothing is lost and nothing needs to be resent. You put money into the BOP system and it stays with them wherever they go.</w:t>
       </w:r>
     </w:p>
     <w:p>
@@ -574,16 +574,11 @@
         <w:rPr>
           <w:rFonts w:ascii="Calibri" w:hAnsi="Calibri"/>
           <w:b w:val="0"/>
-          <w:i w:val="0"/>
+          <w:i/>
           <w:sz w:val="22"/>
         </w:rPr>
-        <w:t>*Bilal Khan has been incarcerated in the federal system since May 2012.</w:t>
+        <w:t>Bilal Khan has been incarcerated in the federal system since May 2012. He is a United States Marine Corps veteran and the author of</w:t>
       </w:r>
-    </w:p>
-    <w:p>
-      <w:pPr>
-        <w:spacing w:after="160" w:before="0"/>
-      </w:pPr>
       <w:r>
         <w:rPr>
           <w:rFonts w:ascii="Calibri" w:hAnsi="Calibri"/>
@@ -591,7 +586,7 @@
           <w:i w:val="0"/>
           <w:sz w:val="22"/>
         </w:rPr>
-        <w:t>He is a United States Marine Corps veteran and the author of</w:t>
+        <w:t xml:space="preserve"> Surviving Pretrial </w:t>
       </w:r>
       <w:r>
         <w:rPr>
@@ -600,7 +595,7 @@
           <w:i/>
           <w:sz w:val="22"/>
         </w:rPr>
-        <w:t xml:space="preserve"> Surviving Pretrial </w:t>
+        <w:t>and</w:t>
       </w:r>
       <w:r>
         <w:rPr>
@@ -609,7 +604,7 @@
           <w:i w:val="0"/>
           <w:sz w:val="22"/>
         </w:rPr>
-        <w:t>and</w:t>
+        <w:t xml:space="preserve"> The 2255 Motion Handbook</w:t>
       </w:r>
       <w:r>
         <w:rPr>
@@ -618,16 +613,7 @@
           <w:i/>
           <w:sz w:val="22"/>
         </w:rPr>
-        <w:t xml:space="preserve"> The 2255 Motion Handbook</w:t>
-      </w:r>
-      <w:r>
-        <w:rPr>
-          <w:rFonts w:ascii="Calibri" w:hAnsi="Calibri"/>
-          <w:b w:val="0"/>
-          <w:i w:val="0"/>
-          <w:sz w:val="22"/>
-        </w:rPr>
-        <w:t>, both available on Amazon under the Surviving the Feds Series. This column reflects personal experience and is not legal advice.*</w:t>
+        <w:t>, both available on Amazon under the Surviving the Feds Series. This column reflects personal experience and is not legal advice.</w:t>
       </w:r>
     </w:p>
     <w:sectPr>

</xml_diff>